<commit_message>
fix: confirm DOCX template works with double-brace delimiters
docxtemplater v3.68.5 defaults to single-brace delimiters {/{}.
The production code in docx-template.ts correctly passes
delimiters:{start:'{{',end:'}}'} — template renders with 0 errors.
</commit_message>
<xml_diff>
--- a/public/templates/AIP Pentest Report - Engine Template .docx
+++ b/public/templates/AIP Pentest Report - Engine Template .docx
@@ -47,12 +47,12 @@
             <wp:extent cx="7856371" cy="10163175"/>
             <wp:effectExtent b="0" l="0" r="0" t="0"/>
             <wp:wrapNone/>
-            <wp:docPr id="1" name="image1.jpg"/>
+            <wp:docPr id="1" name="image3.jpg"/>
             <a:graphic>
               <a:graphicData uri="http://schemas.openxmlformats.org/drawingml/2006/picture">
                 <pic:pic>
                   <pic:nvPicPr>
-                    <pic:cNvPr id="0" name="image1.jpg"/>
+                    <pic:cNvPr id="0" name="image3.jpg"/>
                     <pic:cNvPicPr preferRelativeResize="0"/>
                   </pic:nvPicPr>
                   <pic:blipFill>
@@ -1081,7 +1081,7 @@
           <w:szCs w:val="23"/>
           <w:rtl w:val="0"/>
         </w:rPr>
-        <w:t xml:space="preserve">Penetration Test on {{TARGET]]</w:t>
+        <w:t xml:space="preserve">Penetration Test on {{TARGET}}</w:t>
       </w:r>
     </w:p>
     <w:p>
@@ -1772,7 +1772,7 @@
     </w:p>
     <w:sdt>
       <w:sdtPr>
-        <w:id w:val="1760904624"/>
+        <w:id w:val="160914989"/>
         <w:docPartObj>
           <w:docPartGallery w:val="Table of Contents"/>
           <w:docPartUnique w:val="1"/>
@@ -2147,6 +2147,14 @@
               <w:u w:val="none"/>
             </w:rPr>
           </w:pPr>
+          <w:r>
+            <w:rPr>
+              <w:color w:val="000000"/>
+              <w:u w:val="none"/>
+              <w:rtl w:val="0"/>
+            </w:rPr>
+            <w:t xml:space="preserve">Finding Title</w:t>
+          </w:r>
           <w:hyperlink w:anchor="_heading=h.hmtzpkp11xg6">
             <w:r>
               <w:rPr>
@@ -2154,41 +2162,26 @@
                 <w:u w:val="none"/>
                 <w:rtl w:val="0"/>
               </w:rPr>
-              <w:t xml:space="preserve">{{#findings}}</w:t>
               <w:br w:type="textWrapping"/>
-              <w:t xml:space="preserve">01-{{index}}-{{title}}</w:t>
-              <w:tab/>
-              <w:t xml:space="preserve">9</w:t>
             </w:r>
           </w:hyperlink>
-          <w:r>
-            <w:rPr>
-              <w:rtl w:val="0"/>
-            </w:rPr>
-          </w:r>
-        </w:p>
-        <w:p>
-          <w:pPr>
-            <w:tabs>
-              <w:tab w:val="right" w:leader="dot" w:pos="12000"/>
-            </w:tabs>
-            <w:spacing w:before="60" w:lineRule="auto"/>
-            <w:ind w:left="360" w:firstLine="0"/>
-            <w:rPr>
-              <w:color w:val="000000"/>
-              <w:u w:val="none"/>
-            </w:rPr>
-          </w:pPr>
-          <w:hyperlink w:anchor="_heading=h.jmbgrfkhb926">
+          <w:hyperlink w:anchor="_heading=h.hmtzpkp11xg6">
+            <w:r>
+              <w:rPr>
+                <w:rtl w:val="0"/>
+              </w:rPr>
+              <w:t xml:space="preserve">01 - Finding Title</w:t>
+            </w:r>
+          </w:hyperlink>
+          <w:hyperlink w:anchor="_heading=h.hmtzpkp11xg6">
             <w:r>
               <w:rPr>
                 <w:color w:val="000000"/>
                 <w:u w:val="none"/>
                 <w:rtl w:val="0"/>
               </w:rPr>
-              <w:t xml:space="preserve">{{/findings}}</w:t>
               <w:tab/>
-              <w:t xml:space="preserve">10</w:t>
+              <w:t xml:space="preserve">9</w:t>
             </w:r>
           </w:hyperlink>
           <w:r>
@@ -2770,12 +2763,12 @@
           <wp:inline distB="114300" distT="114300" distL="114300" distR="114300">
             <wp:extent cx="928688" cy="928688"/>
             <wp:effectExtent b="0" l="0" r="0" t="0"/>
-            <wp:docPr id="3" name="image3.png"/>
+            <wp:docPr id="3" name="image1.png"/>
             <a:graphic>
               <a:graphicData uri="http://schemas.openxmlformats.org/drawingml/2006/picture">
                 <pic:pic>
                   <pic:nvPicPr>
-                    <pic:cNvPr id="0" name="image3.png"/>
+                    <pic:cNvPr id="0" name="image1.png"/>
                     <pic:cNvPicPr preferRelativeResize="0"/>
                   </pic:nvPicPr>
                   <pic:blipFill>
@@ -3188,7 +3181,7 @@
     <w:sdt>
       <w:sdtPr>
         <w:lock w:val="contentLocked"/>
-        <w:id w:val="1651916736"/>
+        <w:id w:val="581611418"/>
         <w:tag w:val="goog_rdk_0"/>
       </w:sdtPr>
       <w:sdtContent>
@@ -3453,7 +3446,7 @@
                     <w:rFonts w:ascii="IBM Plex Sans" w:cs="IBM Plex Sans" w:eastAsia="IBM Plex Sans" w:hAnsi="IBM Plex Sans"/>
                     <w:rtl w:val="0"/>
                   </w:rPr>
-                  <w:t xml:space="preserve">{{INFO_COUNT]]</w:t>
+                  <w:t xml:space="preserve">{{INFO_COUNT}}</w:t>
                 </w:r>
               </w:p>
             </w:tc>
@@ -3858,7 +3851,7 @@
     <w:sdt>
       <w:sdtPr>
         <w:lock w:val="contentLocked"/>
-        <w:id w:val="-512137758"/>
+        <w:id w:val="631287952"/>
         <w:tag w:val="goog_rdk_1"/>
       </w:sdtPr>
       <w:sdtContent>
@@ -5070,7 +5063,7 @@
           <w:rFonts w:ascii="IBM Plex Sans" w:cs="IBM Plex Sans" w:eastAsia="IBM Plex Sans" w:hAnsi="IBM Plex Sans"/>
           <w:rtl w:val="0"/>
         </w:rPr>
-        <w:t xml:space="preserve">{{impact}</w:t>
+        <w:t xml:space="preserve">{{impact}}</w:t>
       </w:r>
     </w:p>
     <w:p>

</xml_diff>

<commit_message>
feat(report-engine): severity sort, findings summary narrative, shorter About copy (v1 DOCX)
- Sort findings Critical->Informational (CVSS tiebreak) in docx-template
- Add FINDINGS_SUMMARY narrative above the severity counts table (template + render)
- Replace long About page copy with concise 2-paragraph version (AIP + MSP templates)
- Wire findingsSummary through submit route, payload type, and admin ReportEngine UI
- gitignore .env.vercel* snapshots
</commit_message>
<xml_diff>
--- a/public/templates/AIP Pentest Report - Engine Template .docx
+++ b/public/templates/AIP Pentest Report - Engine Template .docx
@@ -2398,37 +2398,17 @@
     <w:p>
       <w:pPr>
         <w:spacing w:after="240" w:before="240" w:line="240" w:lineRule="auto"/>
-        <w:rPr>
-          <w:rFonts w:ascii="IBM Plex Sans" w:cs="IBM Plex Sans" w:eastAsia="IBM Plex Sans" w:hAnsi="IBM Plex Sans"/>
-          <w:b w:val="1"/>
-          <w:bCs w:val="1"/>
-          <w:color w:val="04092f"/>
-          <w:sz w:val="26"/>
-          <w:szCs w:val="26"/>
-        </w:rPr>
-      </w:pPr>
-      <w:r>
-        <w:rPr>
-          <w:rFonts w:ascii="IBM Plex Sans" w:cs="IBM Plex Sans" w:eastAsia="IBM Plex Sans" w:hAnsi="IBM Plex Sans"/>
-          <w:rtl w:val="0"/>
-        </w:rPr>
-        <w:t xml:space="preserve">Security is a fundamental right, not a corporate luxury. At </w:t>
-      </w:r>
-      <w:r>
-        <w:rPr>
-          <w:rFonts w:ascii="IBM Plex Sans" w:cs="IBM Plex Sans" w:eastAsia="IBM Plex Sans" w:hAnsi="IBM Plex Sans"/>
-          <w:b w:val="1"/>
-          <w:bCs w:val="1"/>
-          <w:rtl w:val="0"/>
-        </w:rPr>
-        <w:t xml:space="preserve">AffordablePentesting.com</w:t>
-      </w:r>
-      <w:r>
-        <w:rPr>
-          <w:rFonts w:ascii="IBM Plex Sans" w:cs="IBM Plex Sans" w:eastAsia="IBM Plex Sans" w:hAnsi="IBM Plex Sans"/>
-          <w:rtl w:val="0"/>
-        </w:rPr>
-        <w:t xml:space="preserve">, we specialize in providing high-impact, manual security assessments designed for organizations that require elite technical depth without the enterprise price tag. We bridge the gap between automated scanning and expensive consultancy, ensuring that your data remains yours.</w:t>
+        <w:ind w:left="1440" w:right="1440" w:firstLine="0"/>
+        <w:rPr>
+          <w:rFonts w:ascii="IBM Plex Sans" w:cs="IBM Plex Sans" w:eastAsia="IBM Plex Sans" w:hAnsi="IBM Plex Sans"/>
+        </w:rPr>
+      </w:pPr>
+      <w:r>
+        <w:rPr>
+          <w:rFonts w:ascii="IBM Plex Sans" w:cs="IBM Plex Sans" w:eastAsia="IBM Plex Sans" w:hAnsi="IBM Plex Sans"/>
+          <w:rtl w:val="0"/>
+        </w:rPr>
+        <w:t xml:space="preserve">AffordablePentesting.com delivers manual-grade security assessments powered by AI. Every finding is validated against real exploitability, not just scan output. Our methodology maps to OWASP, NIST, and PTES standards - we just run it faster. The result is a clear, prioritized list of what's actually broken and how to fix it.</w:t>
       </w:r>
       <w:r>
         <w:rPr>
@@ -2439,110 +2419,17 @@
     <w:p>
       <w:pPr>
         <w:spacing w:after="240" w:before="240" w:line="240" w:lineRule="auto"/>
-        <w:rPr>
-          <w:rFonts w:ascii="IBM Plex Sans" w:cs="IBM Plex Sans" w:eastAsia="IBM Plex Sans" w:hAnsi="IBM Plex Sans"/>
-        </w:rPr>
-      </w:pPr>
-      <w:r>
-        <w:rPr>
-          <w:rFonts w:ascii="IBM Plex Sans" w:cs="IBM Plex Sans" w:eastAsia="IBM Plex Sans" w:hAnsi="IBM Plex Sans"/>
-          <w:rtl w:val="0"/>
-        </w:rPr>
-        <w:t xml:space="preserve">Every finding within this document is vetted through a rigorous validation process. We don't just "run tools". Our methodology is built on three core pillars:</w:t>
-      </w:r>
-    </w:p>
-    <w:p>
-      <w:pPr>
-        <w:numPr>
-          <w:ilvl w:val="0"/>
-          <w:numId w:val="2"/>
-        </w:numPr>
-        <w:spacing w:after="0" w:before="240" w:line="240" w:lineRule="auto"/>
-        <w:ind w:left="720" w:hanging="360"/>
-        <w:jc w:val="left"/>
-        <w:rPr/>
-      </w:pPr>
-      <w:r>
-        <w:rPr>
-          <w:rFonts w:ascii="IBM Plex Sans" w:cs="IBM Plex Sans" w:eastAsia="IBM Plex Sans" w:hAnsi="IBM Plex Sans"/>
-          <w:b w:val="1"/>
-          <w:bCs w:val="1"/>
-          <w:rtl w:val="0"/>
-        </w:rPr>
-        <w:t xml:space="preserve">Autonomous Intelligence</w:t>
-      </w:r>
-      <w:r>
-        <w:rPr>
-          <w:rFonts w:ascii="IBM Plex Sans" w:cs="IBM Plex Sans" w:eastAsia="IBM Plex Sans" w:hAnsi="IBM Plex Sans"/>
-          <w:rtl w:val="0"/>
-        </w:rPr>
-        <w:t xml:space="preserve">: Utilizing the latest AI models, we leverage hacking agents that think and evolve in real-time. Unlike static automated scripts or slow human testers, our AI identifies complex attack chains and multi-step vulnerabilities at machine speed, uncovering deep-seated logic flaws that legacy methods miss.</w:t>
-      </w:r>
-      <w:r>
-        <w:rPr>
-          <w:rtl w:val="0"/>
-        </w:rPr>
-      </w:r>
-    </w:p>
-    <w:p>
-      <w:pPr>
-        <w:numPr>
-          <w:ilvl w:val="0"/>
-          <w:numId w:val="2"/>
-        </w:numPr>
-        <w:spacing w:after="0" w:before="0" w:line="240" w:lineRule="auto"/>
-        <w:ind w:left="720" w:hanging="360"/>
-        <w:jc w:val="left"/>
-        <w:rPr/>
-      </w:pPr>
-      <w:r>
-        <w:rPr>
-          <w:rFonts w:ascii="IBM Plex Sans" w:cs="IBM Plex Sans" w:eastAsia="IBM Plex Sans" w:hAnsi="IBM Plex Sans"/>
-          <w:b w:val="1"/>
-          <w:bCs w:val="1"/>
-          <w:rtl w:val="0"/>
-        </w:rPr>
-        <w:t xml:space="preserve">Industry Standards</w:t>
-      </w:r>
-      <w:r>
-        <w:rPr>
-          <w:rFonts w:ascii="IBM Plex Sans" w:cs="IBM Plex Sans" w:eastAsia="IBM Plex Sans" w:hAnsi="IBM Plex Sans"/>
-          <w:rtl w:val="0"/>
-        </w:rPr>
-        <w:t xml:space="preserve">: Our testing workflows are mapped to the OWASP Top 10, NIST SP 800-115, and PTES (Penetration Testing Execution Standard) frameworks.</w:t>
-      </w:r>
-      <w:r>
-        <w:rPr>
-          <w:rtl w:val="0"/>
-        </w:rPr>
-      </w:r>
-    </w:p>
-    <w:p>
-      <w:pPr>
-        <w:numPr>
-          <w:ilvl w:val="0"/>
-          <w:numId w:val="2"/>
-        </w:numPr>
-        <w:spacing w:after="240" w:before="0" w:line="240" w:lineRule="auto"/>
-        <w:ind w:left="720" w:hanging="360"/>
-        <w:jc w:val="left"/>
-        <w:rPr/>
-      </w:pPr>
-      <w:r>
-        <w:rPr>
-          <w:rFonts w:ascii="IBM Plex Sans" w:cs="IBM Plex Sans" w:eastAsia="IBM Plex Sans" w:hAnsi="IBM Plex Sans"/>
-          <w:b w:val="1"/>
-          <w:bCs w:val="1"/>
-          <w:rtl w:val="0"/>
-        </w:rPr>
-        <w:t xml:space="preserve">Dynamic Risk Context</w:t>
-      </w:r>
-      <w:r>
-        <w:rPr>
-          <w:rFonts w:ascii="IBM Plex Sans" w:cs="IBM Plex Sans" w:eastAsia="IBM Plex Sans" w:hAnsi="IBM Plex Sans"/>
-          <w:rtl w:val="0"/>
-        </w:rPr>
-        <w:t xml:space="preserve">: Our AI engine analyzes your specific business logic to categorize risks based on real-world impact. We filter out the noise, making sure your remediation efforts are focused on the vulnerabilities that pose a genuine threat to your operations and data.</w:t>
+        <w:ind w:left="1440" w:right="1440" w:firstLine="0"/>
+        <w:rPr>
+          <w:rFonts w:ascii="IBM Plex Sans" w:cs="IBM Plex Sans" w:eastAsia="IBM Plex Sans" w:hAnsi="IBM Plex Sans"/>
+        </w:rPr>
+      </w:pPr>
+      <w:r>
+        <w:rPr>
+          <w:rFonts w:ascii="IBM Plex Sans" w:cs="IBM Plex Sans" w:eastAsia="IBM Plex Sans" w:hAnsi="IBM Plex Sans"/>
+          <w:rtl w:val="0"/>
+        </w:rPr>
+        <w:t xml:space="preserve">We test your app the same way a human pentester would, but at machine speed. Our AI agents find vulnerabilities, validate them with proof-of-concept exploits, and filter out the noise. What you get is a report focused on what matters: the real risks to your business.</w:t>
       </w:r>
       <w:r>
         <w:rPr>
@@ -3153,6 +3040,27 @@
           <w:rFonts w:ascii="IBM Plex Sans" w:cs="IBM Plex Sans" w:eastAsia="IBM Plex Sans" w:hAnsi="IBM Plex Sans"/>
         </w:rPr>
       </w:pPr>
+      <w:r>
+        <w:rPr>
+          <w:rtl w:val="0"/>
+        </w:rPr>
+      </w:r>
+    </w:p>
+    <w:p>
+      <w:pPr>
+        <w:spacing w:after="240" w:before="240" w:line="240" w:lineRule="auto"/>
+        <w:ind w:left="1440" w:right="1440" w:firstLine="0"/>
+        <w:rPr>
+          <w:rFonts w:ascii="IBM Plex Sans" w:cs="IBM Plex Sans" w:eastAsia="IBM Plex Sans" w:hAnsi="IBM Plex Sans"/>
+        </w:rPr>
+      </w:pPr>
+      <w:r>
+        <w:rPr>
+          <w:rFonts w:ascii="IBM Plex Sans" w:cs="IBM Plex Sans" w:eastAsia="IBM Plex Sans" w:hAnsi="IBM Plex Sans"/>
+          <w:rtl w:val="0"/>
+        </w:rPr>
+        <w:t xml:space="preserve">{{FINDINGS_SUMMARY}}</w:t>
+      </w:r>
       <w:r>
         <w:rPr>
           <w:rtl w:val="0"/>

</xml_diff>

<commit_message>
fix(report-engine): align finding title margins on all iterations
Heading2 style indented titles 1.14in left (ind left=1640), so looped
finding titles 2+ rendered narrower/centered vs the first. Baked the
title paragraph's properties (ind left=-90 right=720, jc=both, line 276,
widowControl) into the Heading2 style; other headings already override
ind themselves so their layout is unchanged.
</commit_message>
<xml_diff>
--- a/public/templates/AIP Pentest Report - Engine Template .docx
+++ b/public/templates/AIP Pentest Report - Engine Template .docx
@@ -7458,7 +7458,10 @@
     <w:basedOn w:val="Normal"/>
     <w:next w:val="Normal"/>
     <w:pPr>
-      <w:ind w:left="1640"/>
+      <w:widowControl w:val="1"/>
+      <w:spacing w:line="276" w:lineRule="auto"/>
+      <w:ind w:left="-90" w:right="720" w:firstLine="0"/>
+      <w:jc w:val="both"/>
     </w:pPr>
     <w:rPr>
       <w:rFonts w:ascii="Arial Black" w:cs="Arial Black" w:eastAsia="Arial Black" w:hAnsi="Arial Black"/>

</xml_diff>